<commit_message>
Eduardo Costa: revisão da Parte 2
Co-Authored-By: Claude Opus 5.5 <noreply@anthropic.com>
Claude-Session: https://claude.ai/code/session_01MJjUEEZrxQDEUifKK2vj9g
</commit_message>
<xml_diff>
--- a/roteiros/eduardo-costa/EduardoCosta_Parte2.docx
+++ b/roteiros/eduardo-costa/EduardoCosta_Parte2.docx
@@ -47,7 +47,7 @@
         <w:rPr>
           <w:color w:val="000000"/>
         </w:rPr>
-        <w:t>Era uma canção romântica, daquelas que falam de amor desesperado, e a voz rasgada de Eduardo encaixou perfeitamente nela. A música estourou nas rádios do país inteiro.</w:t>
+        <w:t>Era uma canção romântica, e a voz rasgada de Eduardo encaixou perfeitamente nela. A música estourou nas rádios do país inteiro.</w:t>
       </w:r>
     </w:p>
     <w:p>
@@ -127,7 +127,7 @@
         <w:rPr>
           <w:color w:val="000000"/>
         </w:rPr>
-        <w:t>E, em dois mil e catorze, veio o maior projeto da carreira dele.</w:t>
+        <w:t>Em dois mil e catorze, veio um dos maiores projetos da carreira dele.</w:t>
       </w:r>
     </w:p>
     <w:p>
@@ -135,7 +135,7 @@
         <w:rPr>
           <w:color w:val="000000"/>
         </w:rPr>
-        <w:t>Um dos maiores nomes do sertanejo, Leonardo, convidou Eduardo para um trabalho em dupla. A ideia era simples. Os dois iam cantar juntos os grandes clássicos das raízes da música sertaneja, num show com cenário inspirado nos cabarés antigos.</w:t>
+        <w:t>Eduardo se juntou a um dos maiores nomes do sertanejo, Leonardo, num trabalho em dupla. A ideia era simples. Os dois iam cantar juntos os grandes clássicos das raízes da música sertaneja, num show com cenário inspirado nos cabarés antigos.</w:t>
       </w:r>
     </w:p>
     <w:p>
@@ -183,7 +183,7 @@
         <w:rPr>
           <w:color w:val="C00000"/>
         </w:rPr>
-        <w:t>Guarde essa amizade. Porque, alguns anos depois, ela ia terminar diante de milhares de pessoas, numa transmissão ao vivo. E a cena que levou Leonardo a se afastar de Eduardo Costa é uma das mais constrangedoras da história do sertanejo.</w:t>
+        <w:t>Guarde essa amizade. Porque, alguns anos depois, ela ia terminar diante de milhares de pessoas, numa transmissão ao vivo. E a cena que levou Leonardo a se afastar de Eduardo Costa deixou o próprio Leonardo constrangido diante das câmeras.</w:t>
       </w:r>
     </w:p>
     <w:p>
@@ -239,7 +239,7 @@
         <w:rPr>
           <w:color w:val="000000"/>
         </w:rPr>
-        <w:t>Mas guarde essa casa na sua cabeça. Ela vai voltar.</w:t>
+        <w:t>Guarde essa casa na sua cabeça. Ela vai voltar.</w:t>
       </w:r>
     </w:p>
     <w:p>
@@ -279,7 +279,7 @@
         <w:rPr>
           <w:color w:val="000000"/>
         </w:rPr>
-        <w:t>Victória era jovem, bonita, e passou a aparecer ao lado do cantor nas redes sociais. Para os fãs, era a mulher que finalmente tinha conquistado o coração do Eduardo Costa das músicas românticas.</w:t>
+        <w:t>Victória era jovem e passou a aparecer ao lado do cantor nas redes sociais.</w:t>
       </w:r>
     </w:p>
     <w:p>
@@ -303,7 +303,7 @@
         <w:rPr>
           <w:color w:val="000000"/>
         </w:rPr>
-        <w:t>E foi num desses términos que começou a parte mais sombria desta história.</w:t>
+        <w:t>Foi num desses términos que começou a parte mais sombria desta história.</w:t>
       </w:r>
     </w:p>
     <w:p>
@@ -311,7 +311,7 @@
         <w:rPr>
           <w:color w:val="C00000"/>
         </w:rPr>
-        <w:t>Porque, no começo de dois mil e dezoito, Victória Villarim gravou um vídeo. E o que ela contou nesse vídeo fez o nome de Eduardo Costa sair das páginas de música e entrar nas páginas policiais.</w:t>
+        <w:t>Porque, no começo de dois mil e dezoito, Victória Villarim gravou um vídeo. E o que ela contou nesse vídeo fez o nome de Eduardo Costa sair das páginas de música e entrar nas manchetes de escândalo.</w:t>
       </w:r>
     </w:p>
     <w:p>

</xml_diff>